<commit_message>
docs(matriz-bi): Matriz BI V.3 y guia de exposicion v2
- Matriz BI V.3: corrige formulas (pendientes, tiempo de validacion,
  rendimiento), agrega KPI "% de docentes con retraso" y notas discretas
  entre parentesis; estructura y filas ocultas sin cambios (D25, P12).
- La V.2 pasa a docs/insumos/versiones antiguas/.
- Guia de exposicion v2: tabla de correcciones de la V.3, grano por
  medida y version publica/interna. La v1 pasa a versiones antiguas/.
- Bitacora: 6.11-6.12, D25, P9 y P12 actualizados.

Co-Authored-By: Claude Opus 5.5 <noreply@anthropic.com>
Claude-Session: https://claude.ai/code/session_01RdKGS5BkJjMyd8Ax3FYQ62
</commit_message>
<xml_diff>
--- a/docs/guias_detalles/Guia_Exposicion_DW_IE1217.docx
+++ b/docs/guias_detalles/Guia_Exposicion_DW_IE1217.docx
@@ -1298,7 +1298,7 @@
           <w:sz w:val="19"/>
           <w:szCs w:val="19"/>
         </w:rPr>
-        <w:t xml:space="preserve">Matriz_BI_Gestion_de_ProcesosV.2.xlsx</w:t>
+        <w:t xml:space="preserve">Matriz_BI_Gestion_de_ProcesosV.3.xlsx</w:t>
       </w:r>
       <w:r>
         <w:t xml:space="preserve">. Es el </w:t>
@@ -1920,6 +1920,828 @@
             </w:pPr>
             <w:r>
               <w:t xml:space="preserve">Power BI (DAX)</w:t>
+            </w:r>
+          </w:p>
+        </w:tc>
+      </w:tr>
+    </w:tbl>
+    <w:p>
+      <w:pPr>
+        <w:pStyle w:val="Heading2"/>
+      </w:pPr>
+      <w:r>
+        <w:t xml:space="preserve">Correcciones de la V.3 frente a la V.2</w:t>
+      </w:r>
+    </w:p>
+    <w:p>
+      <w:pPr>
+        <w:spacing w:after="120"/>
+      </w:pPr>
+      <w:r>
+        <w:t xml:space="preserve">La estructura de la matriz no cambia; se corrigen fórmulas y se agregan notas breves entre paréntesis (en gris) donde algo no se puede medir tal cual.</w:t>
+      </w:r>
+    </w:p>
+    <w:tbl>
+      <w:tblPr>
+        <w:tblW w:type="dxa" w:w="9638"/>
+        <w:tblBorders>
+          <w:top w:val="single" w:color="auto" w:sz="4"/>
+          <w:left w:val="single" w:color="auto" w:sz="4"/>
+          <w:bottom w:val="single" w:color="auto" w:sz="4"/>
+          <w:right w:val="single" w:color="auto" w:sz="4"/>
+          <w:insideH w:val="single" w:color="auto" w:sz="4"/>
+          <w:insideV w:val="single" w:color="auto" w:sz="4"/>
+        </w:tblBorders>
+      </w:tblPr>
+      <w:tblGrid>
+        <w:gridCol w:w="2400"/>
+        <w:gridCol w:w="2700"/>
+        <w:gridCol w:w="4538"/>
+      </w:tblGrid>
+      <w:tr>
+        <w:trPr>
+          <w:tblHeader/>
+        </w:trPr>
+        <w:tc>
+          <w:tcPr>
+            <w:tcW w:type="dxa" w:w="2400"/>
+            <w:tcBorders>
+              <w:top w:val="single" w:color="A6A6A6" w:sz="4"/>
+              <w:left w:val="single" w:color="A6A6A6" w:sz="4"/>
+              <w:bottom w:val="single" w:color="A6A6A6" w:sz="4"/>
+              <w:right w:val="single" w:color="A6A6A6" w:sz="4"/>
+            </w:tcBorders>
+            <w:shd w:fill="D9E2F3" w:color="auto" w:val="clear"/>
+            <w:tcMar>
+              <w:top w:type="dxa" w:w="60"/>
+              <w:left w:type="dxa" w:w="90"/>
+              <w:bottom w:type="dxa" w:w="60"/>
+              <w:right w:type="dxa" w:w="90"/>
+            </w:tcMar>
+          </w:tcPr>
+          <w:p>
+            <w:pPr>
+              <w:spacing w:after="0"/>
+            </w:pPr>
+            <w:r>
+              <w:rPr>
+                <w:b/>
+                <w:bCs/>
+              </w:rPr>
+              <w:t xml:space="preserve">Fila</w:t>
+            </w:r>
+          </w:p>
+        </w:tc>
+        <w:tc>
+          <w:tcPr>
+            <w:tcW w:type="dxa" w:w="2700"/>
+            <w:tcBorders>
+              <w:top w:val="single" w:color="A6A6A6" w:sz="4"/>
+              <w:left w:val="single" w:color="A6A6A6" w:sz="4"/>
+              <w:bottom w:val="single" w:color="A6A6A6" w:sz="4"/>
+              <w:right w:val="single" w:color="A6A6A6" w:sz="4"/>
+            </w:tcBorders>
+            <w:shd w:fill="D9E2F3" w:color="auto" w:val="clear"/>
+            <w:tcMar>
+              <w:top w:type="dxa" w:w="60"/>
+              <w:left w:type="dxa" w:w="90"/>
+              <w:bottom w:type="dxa" w:w="60"/>
+              <w:right w:type="dxa" w:w="90"/>
+            </w:tcMar>
+          </w:tcPr>
+          <w:p>
+            <w:pPr>
+              <w:spacing w:after="0"/>
+            </w:pPr>
+            <w:r>
+              <w:rPr>
+                <w:b/>
+                <w:bCs/>
+              </w:rPr>
+              <w:t xml:space="preserve">Antes</w:t>
+            </w:r>
+          </w:p>
+        </w:tc>
+        <w:tc>
+          <w:tcPr>
+            <w:tcW w:type="dxa" w:w="4538"/>
+            <w:tcBorders>
+              <w:top w:val="single" w:color="A6A6A6" w:sz="4"/>
+              <w:left w:val="single" w:color="A6A6A6" w:sz="4"/>
+              <w:bottom w:val="single" w:color="A6A6A6" w:sz="4"/>
+              <w:right w:val="single" w:color="A6A6A6" w:sz="4"/>
+            </w:tcBorders>
+            <w:shd w:fill="D9E2F3" w:color="auto" w:val="clear"/>
+            <w:tcMar>
+              <w:top w:type="dxa" w:w="60"/>
+              <w:left w:type="dxa" w:w="90"/>
+              <w:bottom w:type="dxa" w:w="60"/>
+              <w:right w:type="dxa" w:w="90"/>
+            </w:tcMar>
+          </w:tcPr>
+          <w:p>
+            <w:pPr>
+              <w:spacing w:after="0"/>
+            </w:pPr>
+            <w:r>
+              <w:rPr>
+                <w:b/>
+                <w:bCs/>
+              </w:rPr>
+              <w:t xml:space="preserve">Ahora</w:t>
+            </w:r>
+          </w:p>
+        </w:tc>
+      </w:tr>
+      <w:tr>
+        <w:tc>
+          <w:tcPr>
+            <w:tcW w:type="dxa" w:w="2400"/>
+            <w:tcBorders>
+              <w:top w:val="single" w:color="A6A6A6" w:sz="4"/>
+              <w:left w:val="single" w:color="A6A6A6" w:sz="4"/>
+              <w:bottom w:val="single" w:color="A6A6A6" w:sz="4"/>
+              <w:right w:val="single" w:color="A6A6A6" w:sz="4"/>
+            </w:tcBorders>
+            <w:tcMar>
+              <w:top w:type="dxa" w:w="60"/>
+              <w:left w:type="dxa" w:w="90"/>
+              <w:bottom w:type="dxa" w:w="60"/>
+              <w:right w:type="dxa" w:w="90"/>
+            </w:tcMar>
+          </w:tcPr>
+          <w:p>
+            <w:pPr>
+              <w:spacing w:after="0"/>
+            </w:pPr>
+            <w:r>
+              <w:t xml:space="preserve">Matrículas pendientes (KPI)</w:t>
+            </w:r>
+          </w:p>
+        </w:tc>
+        <w:tc>
+          <w:tcPr>
+            <w:tcW w:type="dxa" w:w="2700"/>
+            <w:tcBorders>
+              <w:top w:val="single" w:color="A6A6A6" w:sz="4"/>
+              <w:left w:val="single" w:color="A6A6A6" w:sz="4"/>
+              <w:bottom w:val="single" w:color="A6A6A6" w:sz="4"/>
+              <w:right w:val="single" w:color="A6A6A6" w:sz="4"/>
+            </w:tcBorders>
+            <w:tcMar>
+              <w:top w:type="dxa" w:w="60"/>
+              <w:left w:type="dxa" w:w="90"/>
+              <w:bottom w:type="dxa" w:w="60"/>
+              <w:right w:type="dxa" w:w="90"/>
+            </w:tcMar>
+          </w:tcPr>
+          <w:p>
+            <w:pPr>
+              <w:spacing w:after="0"/>
+            </w:pPr>
+            <w:r>
+              <w:t xml:space="preserve">Solicitadas − validadas</w:t>
+            </w:r>
+          </w:p>
+        </w:tc>
+        <w:tc>
+          <w:tcPr>
+            <w:tcW w:type="dxa" w:w="4538"/>
+            <w:tcBorders>
+              <w:top w:val="single" w:color="A6A6A6" w:sz="4"/>
+              <w:left w:val="single" w:color="A6A6A6" w:sz="4"/>
+              <w:bottom w:val="single" w:color="A6A6A6" w:sz="4"/>
+              <w:right w:val="single" w:color="A6A6A6" w:sz="4"/>
+            </w:tcBorders>
+            <w:tcMar>
+              <w:top w:type="dxa" w:w="60"/>
+              <w:left w:type="dxa" w:w="90"/>
+              <w:bottom w:type="dxa" w:w="60"/>
+              <w:right w:type="dxa" w:w="90"/>
+            </w:tcMar>
+          </w:tcPr>
+          <w:p>
+            <w:pPr>
+              <w:spacing w:after="0"/>
+            </w:pPr>
+            <w:r>
+              <w:t xml:space="preserve">Solicitadas − validadas − rechazadas (sigue como KPI)</w:t>
+            </w:r>
+          </w:p>
+        </w:tc>
+      </w:tr>
+      <w:tr>
+        <w:tc>
+          <w:tcPr>
+            <w:tcW w:type="dxa" w:w="2400"/>
+            <w:tcBorders>
+              <w:top w:val="single" w:color="A6A6A6" w:sz="4"/>
+              <w:left w:val="single" w:color="A6A6A6" w:sz="4"/>
+              <w:bottom w:val="single" w:color="A6A6A6" w:sz="4"/>
+              <w:right w:val="single" w:color="A6A6A6" w:sz="4"/>
+            </w:tcBorders>
+            <w:tcMar>
+              <w:top w:type="dxa" w:w="60"/>
+              <w:left w:type="dxa" w:w="90"/>
+              <w:bottom w:type="dxa" w:w="60"/>
+              <w:right w:type="dxa" w:w="90"/>
+            </w:tcMar>
+          </w:tcPr>
+          <w:p>
+            <w:pPr>
+              <w:spacing w:after="0"/>
+            </w:pPr>
+            <w:r>
+              <w:t xml:space="preserve">Tiempo promedio de validación</w:t>
+            </w:r>
+          </w:p>
+        </w:tc>
+        <w:tc>
+          <w:tcPr>
+            <w:tcW w:type="dxa" w:w="2700"/>
+            <w:tcBorders>
+              <w:top w:val="single" w:color="A6A6A6" w:sz="4"/>
+              <w:left w:val="single" w:color="A6A6A6" w:sz="4"/>
+              <w:bottom w:val="single" w:color="A6A6A6" w:sz="4"/>
+              <w:right w:val="single" w:color="A6A6A6" w:sz="4"/>
+            </w:tcBorders>
+            <w:tcMar>
+              <w:top w:type="dxa" w:w="60"/>
+              <w:left w:type="dxa" w:w="90"/>
+              <w:bottom w:type="dxa" w:w="60"/>
+              <w:right w:type="dxa" w:w="90"/>
+            </w:tcMar>
+          </w:tcPr>
+          <w:p>
+            <w:pPr>
+              <w:spacing w:after="0"/>
+            </w:pPr>
+            <w:r>
+              <w:t xml:space="preserve">Días ÷ matrículas validadas</w:t>
+            </w:r>
+          </w:p>
+        </w:tc>
+        <w:tc>
+          <w:tcPr>
+            <w:tcW w:type="dxa" w:w="4538"/>
+            <w:tcBorders>
+              <w:top w:val="single" w:color="A6A6A6" w:sz="4"/>
+              <w:left w:val="single" w:color="A6A6A6" w:sz="4"/>
+              <w:bottom w:val="single" w:color="A6A6A6" w:sz="4"/>
+              <w:right w:val="single" w:color="A6A6A6" w:sz="4"/>
+            </w:tcBorders>
+            <w:tcMar>
+              <w:top w:type="dxa" w:w="60"/>
+              <w:left w:type="dxa" w:w="90"/>
+              <w:bottom w:type="dxa" w:w="60"/>
+              <w:right w:type="dxa" w:w="90"/>
+            </w:tcMar>
+          </w:tcPr>
+          <w:p>
+            <w:pPr>
+              <w:spacing w:after="0"/>
+            </w:pPr>
+            <w:r>
+              <w:t xml:space="preserve">Días ÷ solicitudes con fecha de solicitud y de revisión; pasa de KPI a Indicador</w:t>
+            </w:r>
+          </w:p>
+        </w:tc>
+      </w:tr>
+      <w:tr>
+        <w:tc>
+          <w:tcPr>
+            <w:tcW w:type="dxa" w:w="2400"/>
+            <w:tcBorders>
+              <w:top w:val="single" w:color="A6A6A6" w:sz="4"/>
+              <w:left w:val="single" w:color="A6A6A6" w:sz="4"/>
+              <w:bottom w:val="single" w:color="A6A6A6" w:sz="4"/>
+              <w:right w:val="single" w:color="A6A6A6" w:sz="4"/>
+            </w:tcBorders>
+            <w:tcMar>
+              <w:top w:type="dxa" w:w="60"/>
+              <w:left w:type="dxa" w:w="90"/>
+              <w:bottom w:type="dxa" w:w="60"/>
+              <w:right w:type="dxa" w:w="90"/>
+            </w:tcMar>
+          </w:tcPr>
+          <w:p>
+            <w:pPr>
+              <w:spacing w:after="0"/>
+            </w:pPr>
+            <w:r>
+              <w:t xml:space="preserve">Rendimiento promedio</w:t>
+            </w:r>
+          </w:p>
+        </w:tc>
+        <w:tc>
+          <w:tcPr>
+            <w:tcW w:type="dxa" w:w="2700"/>
+            <w:tcBorders>
+              <w:top w:val="single" w:color="A6A6A6" w:sz="4"/>
+              <w:left w:val="single" w:color="A6A6A6" w:sz="4"/>
+              <w:bottom w:val="single" w:color="A6A6A6" w:sz="4"/>
+              <w:right w:val="single" w:color="A6A6A6" w:sz="4"/>
+            </w:tcBorders>
+            <w:tcMar>
+              <w:top w:type="dxa" w:w="60"/>
+              <w:left w:type="dxa" w:w="90"/>
+              <w:bottom w:type="dxa" w:w="60"/>
+              <w:right w:type="dxa" w:w="90"/>
+            </w:tcMar>
+          </w:tcPr>
+          <w:p>
+            <w:pPr>
+              <w:spacing w:after="0"/>
+            </w:pPr>
+            <w:r>
+              <w:t xml:space="preserve">Notas ÷ notas registradas</w:t>
+            </w:r>
+          </w:p>
+        </w:tc>
+        <w:tc>
+          <w:tcPr>
+            <w:tcW w:type="dxa" w:w="4538"/>
+            <w:tcBorders>
+              <w:top w:val="single" w:color="A6A6A6" w:sz="4"/>
+              <w:left w:val="single" w:color="A6A6A6" w:sz="4"/>
+              <w:bottom w:val="single" w:color="A6A6A6" w:sz="4"/>
+              <w:right w:val="single" w:color="A6A6A6" w:sz="4"/>
+            </w:tcBorders>
+            <w:tcMar>
+              <w:top w:type="dxa" w:w="60"/>
+              <w:left w:type="dxa" w:w="90"/>
+              <w:bottom w:type="dxa" w:w="60"/>
+              <w:right w:type="dxa" w:w="90"/>
+            </w:tcMar>
+          </w:tcPr>
+          <w:p>
+            <w:pPr>
+              <w:spacing w:after="0"/>
+            </w:pPr>
+            <w:r>
+              <w:t xml:space="preserve">Notas ÷ notas con evidencia; pasa de KPI a Indicador</w:t>
+            </w:r>
+          </w:p>
+        </w:tc>
+      </w:tr>
+      <w:tr>
+        <w:tc>
+          <w:tcPr>
+            <w:tcW w:type="dxa" w:w="2400"/>
+            <w:tcBorders>
+              <w:top w:val="single" w:color="A6A6A6" w:sz="4"/>
+              <w:left w:val="single" w:color="A6A6A6" w:sz="4"/>
+              <w:bottom w:val="single" w:color="A6A6A6" w:sz="4"/>
+              <w:right w:val="single" w:color="A6A6A6" w:sz="4"/>
+            </w:tcBorders>
+            <w:tcMar>
+              <w:top w:type="dxa" w:w="60"/>
+              <w:left w:type="dxa" w:w="90"/>
+              <w:bottom w:type="dxa" w:w="60"/>
+              <w:right w:type="dxa" w:w="90"/>
+            </w:tcMar>
+          </w:tcPr>
+          <w:p>
+            <w:pPr>
+              <w:spacing w:after="0"/>
+            </w:pPr>
+            <w:r>
+              <w:t xml:space="preserve">Incidencias de programación</w:t>
+            </w:r>
+          </w:p>
+        </w:tc>
+        <w:tc>
+          <w:tcPr>
+            <w:tcW w:type="dxa" w:w="2700"/>
+            <w:tcBorders>
+              <w:top w:val="single" w:color="A6A6A6" w:sz="4"/>
+              <w:left w:val="single" w:color="A6A6A6" w:sz="4"/>
+              <w:bottom w:val="single" w:color="A6A6A6" w:sz="4"/>
+              <w:right w:val="single" w:color="A6A6A6" w:sz="4"/>
+            </w:tcBorders>
+            <w:tcMar>
+              <w:top w:type="dxa" w:w="60"/>
+              <w:left w:type="dxa" w:w="90"/>
+              <w:bottom w:type="dxa" w:w="60"/>
+              <w:right w:type="dxa" w:w="90"/>
+            </w:tcMar>
+          </w:tcPr>
+          <w:p>
+            <w:pPr>
+              <w:spacing w:after="0"/>
+            </w:pPr>
+            <w:r>
+              <w:t xml:space="preserve">Cambios o cruces de horario</w:t>
+            </w:r>
+          </w:p>
+        </w:tc>
+        <w:tc>
+          <w:tcPr>
+            <w:tcW w:type="dxa" w:w="4538"/>
+            <w:tcBorders>
+              <w:top w:val="single" w:color="A6A6A6" w:sz="4"/>
+              <w:left w:val="single" w:color="A6A6A6" w:sz="4"/>
+              <w:bottom w:val="single" w:color="A6A6A6" w:sz="4"/>
+              <w:right w:val="single" w:color="A6A6A6" w:sz="4"/>
+            </w:tcBorders>
+            <w:tcMar>
+              <w:top w:type="dxa" w:w="60"/>
+              <w:left w:type="dxa" w:w="90"/>
+              <w:bottom w:type="dxa" w:w="60"/>
+              <w:right w:type="dxa" w:w="90"/>
+            </w:tcMar>
+          </w:tcPr>
+          <w:p>
+            <w:pPr>
+              <w:spacing w:after="0"/>
+            </w:pPr>
+            <w:r>
+              <w:t xml:space="preserve">Sesiones reprogramadas, con la nota (aproximación: la fuente no registra cambios ni cruces de horario)</w:t>
+            </w:r>
+          </w:p>
+        </w:tc>
+      </w:tr>
+      <w:tr>
+        <w:tc>
+          <w:tcPr>
+            <w:tcW w:type="dxa" w:w="2400"/>
+            <w:tcBorders>
+              <w:top w:val="single" w:color="A6A6A6" w:sz="4"/>
+              <w:left w:val="single" w:color="A6A6A6" w:sz="4"/>
+              <w:bottom w:val="single" w:color="A6A6A6" w:sz="4"/>
+              <w:right w:val="single" w:color="A6A6A6" w:sz="4"/>
+            </w:tcBorders>
+            <w:tcMar>
+              <w:top w:type="dxa" w:w="60"/>
+              <w:left w:type="dxa" w:w="90"/>
+              <w:bottom w:type="dxa" w:w="60"/>
+              <w:right w:type="dxa" w:w="90"/>
+            </w:tcMar>
+          </w:tcPr>
+          <w:p>
+            <w:pPr>
+              <w:spacing w:after="0"/>
+            </w:pPr>
+            <w:r>
+              <w:t xml:space="preserve">% de docentes con retraso</w:t>
+            </w:r>
+          </w:p>
+        </w:tc>
+        <w:tc>
+          <w:tcPr>
+            <w:tcW w:type="dxa" w:w="2700"/>
+            <w:tcBorders>
+              <w:top w:val="single" w:color="A6A6A6" w:sz="4"/>
+              <w:left w:val="single" w:color="A6A6A6" w:sz="4"/>
+              <w:bottom w:val="single" w:color="A6A6A6" w:sz="4"/>
+              <w:right w:val="single" w:color="A6A6A6" w:sz="4"/>
+            </w:tcBorders>
+            <w:tcMar>
+              <w:top w:type="dxa" w:w="60"/>
+              <w:left w:type="dxa" w:w="90"/>
+              <w:bottom w:type="dxa" w:w="60"/>
+              <w:right w:type="dxa" w:w="90"/>
+            </w:tcMar>
+          </w:tcPr>
+          <w:p>
+            <w:pPr>
+              <w:spacing w:after="0"/>
+            </w:pPr>
+            <w:r>
+              <w:t xml:space="preserve">No estaba</w:t>
+            </w:r>
+          </w:p>
+        </w:tc>
+        <w:tc>
+          <w:tcPr>
+            <w:tcW w:type="dxa" w:w="4538"/>
+            <w:tcBorders>
+              <w:top w:val="single" w:color="A6A6A6" w:sz="4"/>
+              <w:left w:val="single" w:color="A6A6A6" w:sz="4"/>
+              <w:bottom w:val="single" w:color="A6A6A6" w:sz="4"/>
+              <w:right w:val="single" w:color="A6A6A6" w:sz="4"/>
+            </w:tcBorders>
+            <w:tcMar>
+              <w:top w:type="dxa" w:w="60"/>
+              <w:left w:type="dxa" w:w="90"/>
+              <w:bottom w:type="dxa" w:w="60"/>
+              <w:right w:type="dxa" w:w="90"/>
+            </w:tcMar>
+          </w:tcPr>
+          <w:p>
+            <w:pPr>
+              <w:spacing w:after="0"/>
+            </w:pPr>
+            <w:r>
+              <w:t xml:space="preserve">Fila nueva (KPI) en 2.0, con la nota (umbral de retraso por definir)</w:t>
+            </w:r>
+          </w:p>
+        </w:tc>
+      </w:tr>
+      <w:tr>
+        <w:tc>
+          <w:tcPr>
+            <w:tcW w:type="dxa" w:w="2400"/>
+            <w:tcBorders>
+              <w:top w:val="single" w:color="A6A6A6" w:sz="4"/>
+              <w:left w:val="single" w:color="A6A6A6" w:sz="4"/>
+              <w:bottom w:val="single" w:color="A6A6A6" w:sz="4"/>
+              <w:right w:val="single" w:color="A6A6A6" w:sz="4"/>
+            </w:tcBorders>
+            <w:tcMar>
+              <w:top w:type="dxa" w:w="60"/>
+              <w:left w:type="dxa" w:w="90"/>
+              <w:bottom w:type="dxa" w:w="60"/>
+              <w:right w:type="dxa" w:w="90"/>
+            </w:tcMar>
+          </w:tcPr>
+          <w:p>
+            <w:pPr>
+              <w:spacing w:after="0"/>
+            </w:pPr>
+            <w:r>
+              <w:t xml:space="preserve">Información requerida 2.0</w:t>
+            </w:r>
+          </w:p>
+        </w:tc>
+        <w:tc>
+          <w:tcPr>
+            <w:tcW w:type="dxa" w:w="2700"/>
+            <w:tcBorders>
+              <w:top w:val="single" w:color="A6A6A6" w:sz="4"/>
+              <w:left w:val="single" w:color="A6A6A6" w:sz="4"/>
+              <w:bottom w:val="single" w:color="A6A6A6" w:sz="4"/>
+              <w:right w:val="single" w:color="A6A6A6" w:sz="4"/>
+            </w:tcBorders>
+            <w:tcMar>
+              <w:top w:type="dxa" w:w="60"/>
+              <w:left w:type="dxa" w:w="90"/>
+              <w:bottom w:type="dxa" w:w="60"/>
+              <w:right w:type="dxa" w:w="90"/>
+            </w:tcMar>
+          </w:tcPr>
+          <w:p>
+            <w:pPr>
+              <w:spacing w:after="0"/>
+            </w:pPr>
+            <w:r>
+              <w:t xml:space="preserve">Avance del plan y desempeño docente</w:t>
+            </w:r>
+          </w:p>
+        </w:tc>
+        <w:tc>
+          <w:tcPr>
+            <w:tcW w:type="dxa" w:w="4538"/>
+            <w:tcBorders>
+              <w:top w:val="single" w:color="A6A6A6" w:sz="4"/>
+              <w:left w:val="single" w:color="A6A6A6" w:sz="4"/>
+              <w:bottom w:val="single" w:color="A6A6A6" w:sz="4"/>
+              <w:right w:val="single" w:color="A6A6A6" w:sz="4"/>
+            </w:tcBorders>
+            <w:tcMar>
+              <w:top w:type="dxa" w:w="60"/>
+              <w:left w:type="dxa" w:w="90"/>
+              <w:bottom w:type="dxa" w:w="60"/>
+              <w:right w:type="dxa" w:w="90"/>
+            </w:tcMar>
+          </w:tcPr>
+          <w:p>
+            <w:pPr>
+              <w:spacing w:after="0"/>
+            </w:pPr>
+            <w:r>
+              <w:t xml:space="preserve">Horarios de sesiones dictadas y entrega de materiales a tiempo por docente</w:t>
+            </w:r>
+          </w:p>
+        </w:tc>
+      </w:tr>
+      <w:tr>
+        <w:tc>
+          <w:tcPr>
+            <w:tcW w:type="dxa" w:w="2400"/>
+            <w:tcBorders>
+              <w:top w:val="single" w:color="A6A6A6" w:sz="4"/>
+              <w:left w:val="single" w:color="A6A6A6" w:sz="4"/>
+              <w:bottom w:val="single" w:color="A6A6A6" w:sz="4"/>
+              <w:right w:val="single" w:color="A6A6A6" w:sz="4"/>
+            </w:tcBorders>
+            <w:tcMar>
+              <w:top w:type="dxa" w:w="60"/>
+              <w:left w:type="dxa" w:w="90"/>
+              <w:bottom w:type="dxa" w:w="60"/>
+              <w:right w:type="dxa" w:w="90"/>
+            </w:tcMar>
+          </w:tcPr>
+          <w:p>
+            <w:pPr>
+              <w:spacing w:after="0"/>
+            </w:pPr>
+            <w:r>
+              <w:t xml:space="preserve">Procesos 3.0 y 5.0</w:t>
+            </w:r>
+          </w:p>
+        </w:tc>
+        <w:tc>
+          <w:tcPr>
+            <w:tcW w:type="dxa" w:w="2700"/>
+            <w:tcBorders>
+              <w:top w:val="single" w:color="A6A6A6" w:sz="4"/>
+              <w:left w:val="single" w:color="A6A6A6" w:sz="4"/>
+              <w:bottom w:val="single" w:color="A6A6A6" w:sz="4"/>
+              <w:right w:val="single" w:color="A6A6A6" w:sz="4"/>
+            </w:tcBorders>
+            <w:tcMar>
+              <w:top w:type="dxa" w:w="60"/>
+              <w:left w:type="dxa" w:w="90"/>
+              <w:bottom w:type="dxa" w:w="60"/>
+              <w:right w:type="dxa" w:w="90"/>
+            </w:tcMar>
+          </w:tcPr>
+          <w:p>
+            <w:pPr>
+              <w:spacing w:after="0"/>
+            </w:pPr>
+            <w:r>
+              <w:t xml:space="preserve">Sin aclaración</w:t>
+            </w:r>
+          </w:p>
+        </w:tc>
+        <w:tc>
+          <w:tcPr>
+            <w:tcW w:type="dxa" w:w="4538"/>
+            <w:tcBorders>
+              <w:top w:val="single" w:color="A6A6A6" w:sz="4"/>
+              <w:left w:val="single" w:color="A6A6A6" w:sz="4"/>
+              <w:bottom w:val="single" w:color="A6A6A6" w:sz="4"/>
+              <w:right w:val="single" w:color="A6A6A6" w:sz="4"/>
+            </w:tcBorders>
+            <w:tcMar>
+              <w:top w:type="dxa" w:w="60"/>
+              <w:left w:type="dxa" w:w="90"/>
+              <w:bottom w:type="dxa" w:w="60"/>
+              <w:right w:type="dxa" w:w="90"/>
+            </w:tcMar>
+          </w:tcPr>
+          <w:p>
+            <w:pPr>
+              <w:spacing w:after="0"/>
+            </w:pPr>
+            <w:r>
+              <w:t xml:space="preserve">Se marcan (fuera del alcance del DW)</w:t>
+            </w:r>
+          </w:p>
+        </w:tc>
+      </w:tr>
+      <w:tr>
+        <w:tc>
+          <w:tcPr>
+            <w:tcW w:type="dxa" w:w="2400"/>
+            <w:tcBorders>
+              <w:top w:val="single" w:color="A6A6A6" w:sz="4"/>
+              <w:left w:val="single" w:color="A6A6A6" w:sz="4"/>
+              <w:bottom w:val="single" w:color="A6A6A6" w:sz="4"/>
+              <w:right w:val="single" w:color="A6A6A6" w:sz="4"/>
+            </w:tcBorders>
+            <w:tcMar>
+              <w:top w:type="dxa" w:w="60"/>
+              <w:left w:type="dxa" w:w="90"/>
+              <w:bottom w:type="dxa" w:w="60"/>
+              <w:right w:type="dxa" w:w="90"/>
+            </w:tcMar>
+          </w:tcPr>
+          <w:p>
+            <w:pPr>
+              <w:spacing w:after="0"/>
+            </w:pPr>
+            <w:r>
+              <w:t xml:space="preserve">Frecuencia y responsable</w:t>
+            </w:r>
+          </w:p>
+        </w:tc>
+        <w:tc>
+          <w:tcPr>
+            <w:tcW w:type="dxa" w:w="2700"/>
+            <w:tcBorders>
+              <w:top w:val="single" w:color="A6A6A6" w:sz="4"/>
+              <w:left w:val="single" w:color="A6A6A6" w:sz="4"/>
+              <w:bottom w:val="single" w:color="A6A6A6" w:sz="4"/>
+              <w:right w:val="single" w:color="A6A6A6" w:sz="4"/>
+            </w:tcBorders>
+            <w:tcMar>
+              <w:top w:type="dxa" w:w="60"/>
+              <w:left w:type="dxa" w:w="90"/>
+              <w:bottom w:type="dxa" w:w="60"/>
+              <w:right w:type="dxa" w:w="90"/>
+            </w:tcMar>
+          </w:tcPr>
+          <w:p>
+            <w:pPr>
+              <w:spacing w:after="0"/>
+            </w:pPr>
+            <w:r>
+              <w:t xml:space="preserve">Vacíos</w:t>
+            </w:r>
+          </w:p>
+        </w:tc>
+        <w:tc>
+          <w:tcPr>
+            <w:tcW w:type="dxa" w:w="4538"/>
+            <w:tcBorders>
+              <w:top w:val="single" w:color="A6A6A6" w:sz="4"/>
+              <w:left w:val="single" w:color="A6A6A6" w:sz="4"/>
+              <w:bottom w:val="single" w:color="A6A6A6" w:sz="4"/>
+              <w:right w:val="single" w:color="A6A6A6" w:sz="4"/>
+            </w:tcBorders>
+            <w:tcMar>
+              <w:top w:type="dxa" w:w="60"/>
+              <w:left w:type="dxa" w:w="90"/>
+              <w:bottom w:type="dxa" w:w="60"/>
+              <w:right w:type="dxa" w:w="90"/>
+            </w:tcMar>
+          </w:tcPr>
+          <w:p>
+            <w:pPr>
+              <w:spacing w:after="0"/>
+            </w:pPr>
+            <w:r>
+              <w:t xml:space="preserve">Llenados con la nota (propuesta); la meta la fija el colegio</w:t>
+            </w:r>
+          </w:p>
+        </w:tc>
+      </w:tr>
+      <w:tr>
+        <w:tc>
+          <w:tcPr>
+            <w:tcW w:type="dxa" w:w="2400"/>
+            <w:tcBorders>
+              <w:top w:val="single" w:color="A6A6A6" w:sz="4"/>
+              <w:left w:val="single" w:color="A6A6A6" w:sz="4"/>
+              <w:bottom w:val="single" w:color="A6A6A6" w:sz="4"/>
+              <w:right w:val="single" w:color="A6A6A6" w:sz="4"/>
+            </w:tcBorders>
+            <w:tcMar>
+              <w:top w:type="dxa" w:w="60"/>
+              <w:left w:type="dxa" w:w="90"/>
+              <w:bottom w:type="dxa" w:w="60"/>
+              <w:right w:type="dxa" w:w="90"/>
+            </w:tcMar>
+          </w:tcPr>
+          <w:p>
+            <w:pPr>
+              <w:spacing w:after="0"/>
+            </w:pPr>
+            <w:r>
+              <w:t xml:space="preserve">Guía de lectura</w:t>
+            </w:r>
+          </w:p>
+        </w:tc>
+        <w:tc>
+          <w:tcPr>
+            <w:tcW w:type="dxa" w:w="2700"/>
+            <w:tcBorders>
+              <w:top w:val="single" w:color="A6A6A6" w:sz="4"/>
+              <w:left w:val="single" w:color="A6A6A6" w:sz="4"/>
+              <w:bottom w:val="single" w:color="A6A6A6" w:sz="4"/>
+              <w:right w:val="single" w:color="A6A6A6" w:sz="4"/>
+            </w:tcBorders>
+            <w:tcMar>
+              <w:top w:type="dxa" w:w="60"/>
+              <w:left w:type="dxa" w:w="90"/>
+              <w:bottom w:type="dxa" w:w="60"/>
+              <w:right w:type="dxa" w:w="90"/>
+            </w:tcMar>
+          </w:tcPr>
+          <w:p>
+            <w:pPr>
+              <w:spacing w:after="0"/>
+            </w:pPr>
+            <w:r>
+              <w:t xml:space="preserve">Nombres distintos a la matriz</w:t>
+            </w:r>
+          </w:p>
+        </w:tc>
+        <w:tc>
+          <w:tcPr>
+            <w:tcW w:type="dxa" w:w="4538"/>
+            <w:tcBorders>
+              <w:top w:val="single" w:color="A6A6A6" w:sz="4"/>
+              <w:left w:val="single" w:color="A6A6A6" w:sz="4"/>
+              <w:bottom w:val="single" w:color="A6A6A6" w:sz="4"/>
+              <w:right w:val="single" w:color="A6A6A6" w:sz="4"/>
+            </w:tcBorders>
+            <w:tcMar>
+              <w:top w:type="dxa" w:w="60"/>
+              <w:left w:type="dxa" w:w="90"/>
+              <w:bottom w:type="dxa" w:w="60"/>
+              <w:right w:type="dxa" w:w="90"/>
+            </w:tcMar>
+          </w:tcPr>
+          <w:p>
+            <w:pPr>
+              <w:spacing w:after="0"/>
+            </w:pPr>
+            <w:r>
+              <w:t xml:space="preserve">Se indica al lado: (en la matriz: Actor) y (en la matriz: Pregunta de analítica)</w:t>
             </w:r>
           </w:p>
         </w:tc>
@@ -3458,7 +4280,7 @@
         <w:t xml:space="preserve">qué es una fila</w:t>
       </w:r>
       <w:r>
-        <w:t xml:space="preserve"> del hecho y </w:t>
+        <w:t xml:space="preserve"> y </w:t>
       </w:r>
       <w:r>
         <w:rPr>
@@ -3468,7 +4290,17 @@
         <w:t xml:space="preserve">a qué nivel de jerarquía</w:t>
       </w:r>
       <w:r>
-        <w:t xml:space="preserve"> de tiempo se registra.</w:t>
+        <w:t xml:space="preserve"> de tiempo se registra. Se expresa con </w:t>
+      </w:r>
+      <w:r>
+        <w:rPr>
+          <w:b/>
+          <w:bCs/>
+        </w:rPr>
+        <w:t xml:space="preserve">una sola palabra + el nivel</w:t>
+      </w:r>
+      <w:r>
+        <w:t xml:space="preserve">, no con una oración. Primero a nivel de hecho:</w:t>
       </w:r>
     </w:p>
     <w:tbl>
@@ -3923,6 +4755,904 @@
     </w:tbl>
     <w:p>
       <w:pPr>
+        <w:spacing w:after="80"/>
+      </w:pPr>
+    </w:p>
+    <w:p>
+      <w:pPr>
+        <w:spacing w:after="120"/>
+      </w:pPr>
+      <w:r>
+        <w:t xml:space="preserve">En la hoja V2 el grano se indica </w:t>
+      </w:r>
+      <w:r>
+        <w:rPr>
+          <w:b/>
+          <w:bCs/>
+        </w:rPr>
+        <w:t xml:space="preserve">por medida</w:t>
+      </w:r>
+      <w:r>
+        <w:t xml:space="preserve">, porque no todas las medidas de un mismo hecho se leen al mismo nivel:</w:t>
+      </w:r>
+    </w:p>
+    <w:tbl>
+      <w:tblPr>
+        <w:tblW w:type="dxa" w:w="9638"/>
+        <w:tblBorders>
+          <w:top w:val="single" w:color="auto" w:sz="4"/>
+          <w:left w:val="single" w:color="auto" w:sz="4"/>
+          <w:bottom w:val="single" w:color="auto" w:sz="4"/>
+          <w:right w:val="single" w:color="auto" w:sz="4"/>
+          <w:insideH w:val="single" w:color="auto" w:sz="4"/>
+          <w:insideV w:val="single" w:color="auto" w:sz="4"/>
+        </w:tblBorders>
+      </w:tblPr>
+      <w:tblGrid>
+        <w:gridCol w:w="2700"/>
+        <w:gridCol w:w="1500"/>
+        <w:gridCol w:w="1200"/>
+        <w:gridCol w:w="4238"/>
+      </w:tblGrid>
+      <w:tr>
+        <w:trPr>
+          <w:tblHeader/>
+        </w:trPr>
+        <w:tc>
+          <w:tcPr>
+            <w:tcW w:type="dxa" w:w="2700"/>
+            <w:tcBorders>
+              <w:top w:val="single" w:color="A6A6A6" w:sz="4"/>
+              <w:left w:val="single" w:color="A6A6A6" w:sz="4"/>
+              <w:bottom w:val="single" w:color="A6A6A6" w:sz="4"/>
+              <w:right w:val="single" w:color="A6A6A6" w:sz="4"/>
+            </w:tcBorders>
+            <w:shd w:fill="D9E2F3" w:color="auto" w:val="clear"/>
+            <w:tcMar>
+              <w:top w:type="dxa" w:w="60"/>
+              <w:left w:type="dxa" w:w="90"/>
+              <w:bottom w:type="dxa" w:w="60"/>
+              <w:right w:type="dxa" w:w="90"/>
+            </w:tcMar>
+          </w:tcPr>
+          <w:p>
+            <w:pPr>
+              <w:spacing w:after="0"/>
+            </w:pPr>
+            <w:r>
+              <w:rPr>
+                <w:b/>
+                <w:bCs/>
+              </w:rPr>
+              <w:t xml:space="preserve">Medida</w:t>
+            </w:r>
+          </w:p>
+        </w:tc>
+        <w:tc>
+          <w:tcPr>
+            <w:tcW w:type="dxa" w:w="1500"/>
+            <w:tcBorders>
+              <w:top w:val="single" w:color="A6A6A6" w:sz="4"/>
+              <w:left w:val="single" w:color="A6A6A6" w:sz="4"/>
+              <w:bottom w:val="single" w:color="A6A6A6" w:sz="4"/>
+              <w:right w:val="single" w:color="A6A6A6" w:sz="4"/>
+            </w:tcBorders>
+            <w:shd w:fill="D9E2F3" w:color="auto" w:val="clear"/>
+            <w:tcMar>
+              <w:top w:type="dxa" w:w="60"/>
+              <w:left w:type="dxa" w:w="90"/>
+              <w:bottom w:type="dxa" w:w="60"/>
+              <w:right w:type="dxa" w:w="90"/>
+            </w:tcMar>
+          </w:tcPr>
+          <w:p>
+            <w:pPr>
+              <w:spacing w:after="0"/>
+            </w:pPr>
+            <w:r>
+              <w:rPr>
+                <w:b/>
+                <w:bCs/>
+              </w:rPr>
+              <w:t xml:space="preserve">Grano</w:t>
+            </w:r>
+          </w:p>
+        </w:tc>
+        <w:tc>
+          <w:tcPr>
+            <w:tcW w:type="dxa" w:w="1200"/>
+            <w:tcBorders>
+              <w:top w:val="single" w:color="A6A6A6" w:sz="4"/>
+              <w:left w:val="single" w:color="A6A6A6" w:sz="4"/>
+              <w:bottom w:val="single" w:color="A6A6A6" w:sz="4"/>
+              <w:right w:val="single" w:color="A6A6A6" w:sz="4"/>
+            </w:tcBorders>
+            <w:shd w:fill="D9E2F3" w:color="auto" w:val="clear"/>
+            <w:tcMar>
+              <w:top w:type="dxa" w:w="60"/>
+              <w:left w:type="dxa" w:w="90"/>
+              <w:bottom w:type="dxa" w:w="60"/>
+              <w:right w:type="dxa" w:w="90"/>
+            </w:tcMar>
+          </w:tcPr>
+          <w:p>
+            <w:pPr>
+              <w:spacing w:after="0"/>
+            </w:pPr>
+            <w:r>
+              <w:rPr>
+                <w:b/>
+                <w:bCs/>
+              </w:rPr>
+              <w:t xml:space="preserve">Nivel</w:t>
+            </w:r>
+          </w:p>
+        </w:tc>
+        <w:tc>
+          <w:tcPr>
+            <w:tcW w:type="dxa" w:w="4238"/>
+            <w:tcBorders>
+              <w:top w:val="single" w:color="A6A6A6" w:sz="4"/>
+              <w:left w:val="single" w:color="A6A6A6" w:sz="4"/>
+              <w:bottom w:val="single" w:color="A6A6A6" w:sz="4"/>
+              <w:right w:val="single" w:color="A6A6A6" w:sz="4"/>
+            </w:tcBorders>
+            <w:shd w:fill="D9E2F3" w:color="auto" w:val="clear"/>
+            <w:tcMar>
+              <w:top w:type="dxa" w:w="60"/>
+              <w:left w:type="dxa" w:w="90"/>
+              <w:bottom w:type="dxa" w:w="60"/>
+              <w:right w:type="dxa" w:w="90"/>
+            </w:tcMar>
+          </w:tcPr>
+          <w:p>
+            <w:pPr>
+              <w:spacing w:after="0"/>
+            </w:pPr>
+            <w:r>
+              <w:rPr>
+                <w:b/>
+                <w:bCs/>
+              </w:rPr>
+              <w:t xml:space="preserve">Por qué</w:t>
+            </w:r>
+          </w:p>
+        </w:tc>
+      </w:tr>
+      <w:tr>
+        <w:tc>
+          <w:tcPr>
+            <w:tcW w:type="dxa" w:w="2700"/>
+            <w:tcBorders>
+              <w:top w:val="single" w:color="A6A6A6" w:sz="4"/>
+              <w:left w:val="single" w:color="A6A6A6" w:sz="4"/>
+              <w:bottom w:val="single" w:color="A6A6A6" w:sz="4"/>
+              <w:right w:val="single" w:color="A6A6A6" w:sz="4"/>
+            </w:tcBorders>
+            <w:tcMar>
+              <w:top w:type="dxa" w:w="60"/>
+              <w:left w:type="dxa" w:w="90"/>
+              <w:bottom w:type="dxa" w:w="60"/>
+              <w:right w:type="dxa" w:w="90"/>
+            </w:tcMar>
+          </w:tcPr>
+          <w:p>
+            <w:pPr>
+              <w:spacing w:after="0"/>
+            </w:pPr>
+            <w:r>
+              <w:t xml:space="preserve">Matrículas solicitadas</w:t>
+            </w:r>
+          </w:p>
+        </w:tc>
+        <w:tc>
+          <w:tcPr>
+            <w:tcW w:type="dxa" w:w="1500"/>
+            <w:tcBorders>
+              <w:top w:val="single" w:color="A6A6A6" w:sz="4"/>
+              <w:left w:val="single" w:color="A6A6A6" w:sz="4"/>
+              <w:bottom w:val="single" w:color="A6A6A6" w:sz="4"/>
+              <w:right w:val="single" w:color="A6A6A6" w:sz="4"/>
+            </w:tcBorders>
+            <w:tcMar>
+              <w:top w:type="dxa" w:w="60"/>
+              <w:left w:type="dxa" w:w="90"/>
+              <w:bottom w:type="dxa" w:w="60"/>
+              <w:right w:type="dxa" w:w="90"/>
+            </w:tcMar>
+          </w:tcPr>
+          <w:p>
+            <w:pPr>
+              <w:spacing w:after="0"/>
+            </w:pPr>
+            <w:r>
+              <w:t xml:space="preserve">Matrícula</w:t>
+            </w:r>
+          </w:p>
+        </w:tc>
+        <w:tc>
+          <w:tcPr>
+            <w:tcW w:type="dxa" w:w="1200"/>
+            <w:tcBorders>
+              <w:top w:val="single" w:color="A6A6A6" w:sz="4"/>
+              <w:left w:val="single" w:color="A6A6A6" w:sz="4"/>
+              <w:bottom w:val="single" w:color="A6A6A6" w:sz="4"/>
+              <w:right w:val="single" w:color="A6A6A6" w:sz="4"/>
+            </w:tcBorders>
+            <w:tcMar>
+              <w:top w:type="dxa" w:w="60"/>
+              <w:left w:type="dxa" w:w="90"/>
+              <w:bottom w:type="dxa" w:w="60"/>
+              <w:right w:type="dxa" w:w="90"/>
+            </w:tcMar>
+          </w:tcPr>
+          <w:p>
+            <w:pPr>
+              <w:spacing w:after="0"/>
+            </w:pPr>
+            <w:r>
+              <w:t xml:space="preserve">Año</w:t>
+            </w:r>
+          </w:p>
+        </w:tc>
+        <w:tc>
+          <w:tcPr>
+            <w:tcW w:type="dxa" w:w="4238"/>
+            <w:tcBorders>
+              <w:top w:val="single" w:color="A6A6A6" w:sz="4"/>
+              <w:left w:val="single" w:color="A6A6A6" w:sz="4"/>
+              <w:bottom w:val="single" w:color="A6A6A6" w:sz="4"/>
+              <w:right w:val="single" w:color="A6A6A6" w:sz="4"/>
+            </w:tcBorders>
+            <w:tcMar>
+              <w:top w:type="dxa" w:w="60"/>
+              <w:left w:type="dxa" w:w="90"/>
+              <w:bottom w:type="dxa" w:w="60"/>
+              <w:right w:type="dxa" w:w="90"/>
+            </w:tcMar>
+          </w:tcPr>
+          <w:p>
+            <w:pPr>
+              <w:spacing w:after="0"/>
+            </w:pPr>
+            <w:r>
+              <w:t xml:space="preserve">se cuenta una matrícula por estudiante y año</w:t>
+            </w:r>
+          </w:p>
+        </w:tc>
+      </w:tr>
+      <w:tr>
+        <w:tc>
+          <w:tcPr>
+            <w:tcW w:type="dxa" w:w="2700"/>
+            <w:tcBorders>
+              <w:top w:val="single" w:color="A6A6A6" w:sz="4"/>
+              <w:left w:val="single" w:color="A6A6A6" w:sz="4"/>
+              <w:bottom w:val="single" w:color="A6A6A6" w:sz="4"/>
+              <w:right w:val="single" w:color="A6A6A6" w:sz="4"/>
+            </w:tcBorders>
+            <w:tcMar>
+              <w:top w:type="dxa" w:w="60"/>
+              <w:left w:type="dxa" w:w="90"/>
+              <w:bottom w:type="dxa" w:w="60"/>
+              <w:right w:type="dxa" w:w="90"/>
+            </w:tcMar>
+          </w:tcPr>
+          <w:p>
+            <w:pPr>
+              <w:spacing w:after="0"/>
+            </w:pPr>
+            <w:r>
+              <w:t xml:space="preserve">% de ocupación de vacantes</w:t>
+            </w:r>
+          </w:p>
+        </w:tc>
+        <w:tc>
+          <w:tcPr>
+            <w:tcW w:type="dxa" w:w="1500"/>
+            <w:tcBorders>
+              <w:top w:val="single" w:color="A6A6A6" w:sz="4"/>
+              <w:left w:val="single" w:color="A6A6A6" w:sz="4"/>
+              <w:bottom w:val="single" w:color="A6A6A6" w:sz="4"/>
+              <w:right w:val="single" w:color="A6A6A6" w:sz="4"/>
+            </w:tcBorders>
+            <w:tcMar>
+              <w:top w:type="dxa" w:w="60"/>
+              <w:left w:type="dxa" w:w="90"/>
+              <w:bottom w:type="dxa" w:w="60"/>
+              <w:right w:type="dxa" w:w="90"/>
+            </w:tcMar>
+          </w:tcPr>
+          <w:p>
+            <w:pPr>
+              <w:spacing w:after="0"/>
+            </w:pPr>
+            <w:r>
+              <w:t xml:space="preserve">Sección</w:t>
+            </w:r>
+          </w:p>
+        </w:tc>
+        <w:tc>
+          <w:tcPr>
+            <w:tcW w:type="dxa" w:w="1200"/>
+            <w:tcBorders>
+              <w:top w:val="single" w:color="A6A6A6" w:sz="4"/>
+              <w:left w:val="single" w:color="A6A6A6" w:sz="4"/>
+              <w:bottom w:val="single" w:color="A6A6A6" w:sz="4"/>
+              <w:right w:val="single" w:color="A6A6A6" w:sz="4"/>
+            </w:tcBorders>
+            <w:tcMar>
+              <w:top w:type="dxa" w:w="60"/>
+              <w:left w:type="dxa" w:w="90"/>
+              <w:bottom w:type="dxa" w:w="60"/>
+              <w:right w:type="dxa" w:w="90"/>
+            </w:tcMar>
+          </w:tcPr>
+          <w:p>
+            <w:pPr>
+              <w:spacing w:after="0"/>
+            </w:pPr>
+            <w:r>
+              <w:t xml:space="preserve">Año</w:t>
+            </w:r>
+          </w:p>
+        </w:tc>
+        <w:tc>
+          <w:tcPr>
+            <w:tcW w:type="dxa" w:w="4238"/>
+            <w:tcBorders>
+              <w:top w:val="single" w:color="A6A6A6" w:sz="4"/>
+              <w:left w:val="single" w:color="A6A6A6" w:sz="4"/>
+              <w:bottom w:val="single" w:color="A6A6A6" w:sz="4"/>
+              <w:right w:val="single" w:color="A6A6A6" w:sz="4"/>
+            </w:tcBorders>
+            <w:tcMar>
+              <w:top w:type="dxa" w:w="60"/>
+              <w:left w:type="dxa" w:w="90"/>
+              <w:bottom w:type="dxa" w:w="60"/>
+              <w:right w:type="dxa" w:w="90"/>
+            </w:tcMar>
+          </w:tcPr>
+          <w:p>
+            <w:pPr>
+              <w:spacing w:after="0"/>
+            </w:pPr>
+            <w:r>
+              <w:t xml:space="preserve">el cupo es de la sección, no del estudiante</w:t>
+            </w:r>
+          </w:p>
+        </w:tc>
+      </w:tr>
+      <w:tr>
+        <w:tc>
+          <w:tcPr>
+            <w:tcW w:type="dxa" w:w="2700"/>
+            <w:tcBorders>
+              <w:top w:val="single" w:color="A6A6A6" w:sz="4"/>
+              <w:left w:val="single" w:color="A6A6A6" w:sz="4"/>
+              <w:bottom w:val="single" w:color="A6A6A6" w:sz="4"/>
+              <w:right w:val="single" w:color="A6A6A6" w:sz="4"/>
+            </w:tcBorders>
+            <w:tcMar>
+              <w:top w:type="dxa" w:w="60"/>
+              <w:left w:type="dxa" w:w="90"/>
+              <w:bottom w:type="dxa" w:w="60"/>
+              <w:right w:type="dxa" w:w="90"/>
+            </w:tcMar>
+          </w:tcPr>
+          <w:p>
+            <w:pPr>
+              <w:spacing w:after="0"/>
+            </w:pPr>
+            <w:r>
+              <w:t xml:space="preserve">Sesiones programadas</w:t>
+            </w:r>
+          </w:p>
+        </w:tc>
+        <w:tc>
+          <w:tcPr>
+            <w:tcW w:type="dxa" w:w="1500"/>
+            <w:tcBorders>
+              <w:top w:val="single" w:color="A6A6A6" w:sz="4"/>
+              <w:left w:val="single" w:color="A6A6A6" w:sz="4"/>
+              <w:bottom w:val="single" w:color="A6A6A6" w:sz="4"/>
+              <w:right w:val="single" w:color="A6A6A6" w:sz="4"/>
+            </w:tcBorders>
+            <w:tcMar>
+              <w:top w:type="dxa" w:w="60"/>
+              <w:left w:type="dxa" w:w="90"/>
+              <w:bottom w:type="dxa" w:w="60"/>
+              <w:right w:type="dxa" w:w="90"/>
+            </w:tcMar>
+          </w:tcPr>
+          <w:p>
+            <w:pPr>
+              <w:spacing w:after="0"/>
+            </w:pPr>
+            <w:r>
+              <w:t xml:space="preserve">Asignación</w:t>
+            </w:r>
+          </w:p>
+        </w:tc>
+        <w:tc>
+          <w:tcPr>
+            <w:tcW w:type="dxa" w:w="1200"/>
+            <w:tcBorders>
+              <w:top w:val="single" w:color="A6A6A6" w:sz="4"/>
+              <w:left w:val="single" w:color="A6A6A6" w:sz="4"/>
+              <w:bottom w:val="single" w:color="A6A6A6" w:sz="4"/>
+              <w:right w:val="single" w:color="A6A6A6" w:sz="4"/>
+            </w:tcBorders>
+            <w:tcMar>
+              <w:top w:type="dxa" w:w="60"/>
+              <w:left w:type="dxa" w:w="90"/>
+              <w:bottom w:type="dxa" w:w="60"/>
+              <w:right w:type="dxa" w:w="90"/>
+            </w:tcMar>
+          </w:tcPr>
+          <w:p>
+            <w:pPr>
+              <w:spacing w:after="0"/>
+            </w:pPr>
+            <w:r>
+              <w:t xml:space="preserve">Mes</w:t>
+            </w:r>
+          </w:p>
+        </w:tc>
+        <w:tc>
+          <w:tcPr>
+            <w:tcW w:type="dxa" w:w="4238"/>
+            <w:tcBorders>
+              <w:top w:val="single" w:color="A6A6A6" w:sz="4"/>
+              <w:left w:val="single" w:color="A6A6A6" w:sz="4"/>
+              <w:bottom w:val="single" w:color="A6A6A6" w:sz="4"/>
+              <w:right w:val="single" w:color="A6A6A6" w:sz="4"/>
+            </w:tcBorders>
+            <w:tcMar>
+              <w:top w:type="dxa" w:w="60"/>
+              <w:left w:type="dxa" w:w="90"/>
+              <w:bottom w:type="dxa" w:w="60"/>
+              <w:right w:type="dxa" w:w="90"/>
+            </w:tcMar>
+          </w:tcPr>
+          <w:p>
+            <w:pPr>
+              <w:spacing w:after="0"/>
+            </w:pPr>
+            <w:r>
+              <w:t xml:space="preserve">docente + área + sección en un mes</w:t>
+            </w:r>
+          </w:p>
+        </w:tc>
+      </w:tr>
+      <w:tr>
+        <w:tc>
+          <w:tcPr>
+            <w:tcW w:type="dxa" w:w="2700"/>
+            <w:tcBorders>
+              <w:top w:val="single" w:color="A6A6A6" w:sz="4"/>
+              <w:left w:val="single" w:color="A6A6A6" w:sz="4"/>
+              <w:bottom w:val="single" w:color="A6A6A6" w:sz="4"/>
+              <w:right w:val="single" w:color="A6A6A6" w:sz="4"/>
+            </w:tcBorders>
+            <w:tcMar>
+              <w:top w:type="dxa" w:w="60"/>
+              <w:left w:type="dxa" w:w="90"/>
+              <w:bottom w:type="dxa" w:w="60"/>
+              <w:right w:type="dxa" w:w="90"/>
+            </w:tcMar>
+          </w:tcPr>
+          <w:p>
+            <w:pPr>
+              <w:spacing w:after="0"/>
+            </w:pPr>
+            <w:r>
+              <w:t xml:space="preserve">Materiales entregados a tiempo</w:t>
+            </w:r>
+          </w:p>
+        </w:tc>
+        <w:tc>
+          <w:tcPr>
+            <w:tcW w:type="dxa" w:w="1500"/>
+            <w:tcBorders>
+              <w:top w:val="single" w:color="A6A6A6" w:sz="4"/>
+              <w:left w:val="single" w:color="A6A6A6" w:sz="4"/>
+              <w:bottom w:val="single" w:color="A6A6A6" w:sz="4"/>
+              <w:right w:val="single" w:color="A6A6A6" w:sz="4"/>
+            </w:tcBorders>
+            <w:tcMar>
+              <w:top w:type="dxa" w:w="60"/>
+              <w:left w:type="dxa" w:w="90"/>
+              <w:bottom w:type="dxa" w:w="60"/>
+              <w:right w:type="dxa" w:w="90"/>
+            </w:tcMar>
+          </w:tcPr>
+          <w:p>
+            <w:pPr>
+              <w:spacing w:after="0"/>
+            </w:pPr>
+            <w:r>
+              <w:t xml:space="preserve">Asignación</w:t>
+            </w:r>
+          </w:p>
+        </w:tc>
+        <w:tc>
+          <w:tcPr>
+            <w:tcW w:type="dxa" w:w="1200"/>
+            <w:tcBorders>
+              <w:top w:val="single" w:color="A6A6A6" w:sz="4"/>
+              <w:left w:val="single" w:color="A6A6A6" w:sz="4"/>
+              <w:bottom w:val="single" w:color="A6A6A6" w:sz="4"/>
+              <w:right w:val="single" w:color="A6A6A6" w:sz="4"/>
+            </w:tcBorders>
+            <w:tcMar>
+              <w:top w:type="dxa" w:w="60"/>
+              <w:left w:type="dxa" w:w="90"/>
+              <w:bottom w:type="dxa" w:w="60"/>
+              <w:right w:type="dxa" w:w="90"/>
+            </w:tcMar>
+          </w:tcPr>
+          <w:p>
+            <w:pPr>
+              <w:spacing w:after="0"/>
+            </w:pPr>
+            <w:r>
+              <w:t xml:space="preserve">Año</w:t>
+            </w:r>
+          </w:p>
+        </w:tc>
+        <w:tc>
+          <w:tcPr>
+            <w:tcW w:type="dxa" w:w="4238"/>
+            <w:tcBorders>
+              <w:top w:val="single" w:color="A6A6A6" w:sz="4"/>
+              <w:left w:val="single" w:color="A6A6A6" w:sz="4"/>
+              <w:bottom w:val="single" w:color="A6A6A6" w:sz="4"/>
+              <w:right w:val="single" w:color="A6A6A6" w:sz="4"/>
+            </w:tcBorders>
+            <w:tcMar>
+              <w:top w:type="dxa" w:w="60"/>
+              <w:left w:type="dxa" w:w="90"/>
+              <w:bottom w:type="dxa" w:w="60"/>
+              <w:right w:type="dxa" w:w="90"/>
+            </w:tcMar>
+          </w:tcPr>
+          <w:p>
+            <w:pPr>
+              <w:spacing w:after="0"/>
+            </w:pPr>
+            <w:r>
+              <w:t xml:space="preserve">la entrega de materiales es anual</w:t>
+            </w:r>
+          </w:p>
+        </w:tc>
+      </w:tr>
+      <w:tr>
+        <w:tc>
+          <w:tcPr>
+            <w:tcW w:type="dxa" w:w="2700"/>
+            <w:tcBorders>
+              <w:top w:val="single" w:color="A6A6A6" w:sz="4"/>
+              <w:left w:val="single" w:color="A6A6A6" w:sz="4"/>
+              <w:bottom w:val="single" w:color="A6A6A6" w:sz="4"/>
+              <w:right w:val="single" w:color="A6A6A6" w:sz="4"/>
+            </w:tcBorders>
+            <w:tcMar>
+              <w:top w:type="dxa" w:w="60"/>
+              <w:left w:type="dxa" w:w="90"/>
+              <w:bottom w:type="dxa" w:w="60"/>
+              <w:right w:type="dxa" w:w="90"/>
+            </w:tcMar>
+          </w:tcPr>
+          <w:p>
+            <w:pPr>
+              <w:spacing w:after="0"/>
+            </w:pPr>
+            <w:r>
+              <w:t xml:space="preserve">% de docentes con retraso</w:t>
+            </w:r>
+          </w:p>
+        </w:tc>
+        <w:tc>
+          <w:tcPr>
+            <w:tcW w:type="dxa" w:w="1500"/>
+            <w:tcBorders>
+              <w:top w:val="single" w:color="A6A6A6" w:sz="4"/>
+              <w:left w:val="single" w:color="A6A6A6" w:sz="4"/>
+              <w:bottom w:val="single" w:color="A6A6A6" w:sz="4"/>
+              <w:right w:val="single" w:color="A6A6A6" w:sz="4"/>
+            </w:tcBorders>
+            <w:tcMar>
+              <w:top w:type="dxa" w:w="60"/>
+              <w:left w:type="dxa" w:w="90"/>
+              <w:bottom w:type="dxa" w:w="60"/>
+              <w:right w:type="dxa" w:w="90"/>
+            </w:tcMar>
+          </w:tcPr>
+          <w:p>
+            <w:pPr>
+              <w:spacing w:after="0"/>
+            </w:pPr>
+            <w:r>
+              <w:t xml:space="preserve">Docente</w:t>
+            </w:r>
+          </w:p>
+        </w:tc>
+        <w:tc>
+          <w:tcPr>
+            <w:tcW w:type="dxa" w:w="1200"/>
+            <w:tcBorders>
+              <w:top w:val="single" w:color="A6A6A6" w:sz="4"/>
+              <w:left w:val="single" w:color="A6A6A6" w:sz="4"/>
+              <w:bottom w:val="single" w:color="A6A6A6" w:sz="4"/>
+              <w:right w:val="single" w:color="A6A6A6" w:sz="4"/>
+            </w:tcBorders>
+            <w:tcMar>
+              <w:top w:type="dxa" w:w="60"/>
+              <w:left w:type="dxa" w:w="90"/>
+              <w:bottom w:type="dxa" w:w="60"/>
+              <w:right w:type="dxa" w:w="90"/>
+            </w:tcMar>
+          </w:tcPr>
+          <w:p>
+            <w:pPr>
+              <w:spacing w:after="0"/>
+            </w:pPr>
+            <w:r>
+              <w:t xml:space="preserve">Mes</w:t>
+            </w:r>
+          </w:p>
+        </w:tc>
+        <w:tc>
+          <w:tcPr>
+            <w:tcW w:type="dxa" w:w="4238"/>
+            <w:tcBorders>
+              <w:top w:val="single" w:color="A6A6A6" w:sz="4"/>
+              <w:left w:val="single" w:color="A6A6A6" w:sz="4"/>
+              <w:bottom w:val="single" w:color="A6A6A6" w:sz="4"/>
+              <w:right w:val="single" w:color="A6A6A6" w:sz="4"/>
+            </w:tcBorders>
+            <w:tcMar>
+              <w:top w:type="dxa" w:w="60"/>
+              <w:left w:type="dxa" w:w="90"/>
+              <w:bottom w:type="dxa" w:w="60"/>
+              <w:right w:type="dxa" w:w="90"/>
+            </w:tcMar>
+          </w:tcPr>
+          <w:p>
+            <w:pPr>
+              <w:spacing w:after="0"/>
+            </w:pPr>
+            <w:r>
+              <w:t xml:space="preserve">se cuenta docentes, no asignaciones</w:t>
+            </w:r>
+          </w:p>
+        </w:tc>
+      </w:tr>
+      <w:tr>
+        <w:tc>
+          <w:tcPr>
+            <w:tcW w:type="dxa" w:w="2700"/>
+            <w:tcBorders>
+              <w:top w:val="single" w:color="A6A6A6" w:sz="4"/>
+              <w:left w:val="single" w:color="A6A6A6" w:sz="4"/>
+              <w:bottom w:val="single" w:color="A6A6A6" w:sz="4"/>
+              <w:right w:val="single" w:color="A6A6A6" w:sz="4"/>
+            </w:tcBorders>
+            <w:tcMar>
+              <w:top w:type="dxa" w:w="60"/>
+              <w:left w:type="dxa" w:w="90"/>
+              <w:bottom w:type="dxa" w:w="60"/>
+              <w:right w:type="dxa" w:w="90"/>
+            </w:tcMar>
+          </w:tcPr>
+          <w:p>
+            <w:pPr>
+              <w:spacing w:after="0"/>
+            </w:pPr>
+            <w:r>
+              <w:t xml:space="preserve">Rendimiento promedio</w:t>
+            </w:r>
+          </w:p>
+        </w:tc>
+        <w:tc>
+          <w:tcPr>
+            <w:tcW w:type="dxa" w:w="1500"/>
+            <w:tcBorders>
+              <w:top w:val="single" w:color="A6A6A6" w:sz="4"/>
+              <w:left w:val="single" w:color="A6A6A6" w:sz="4"/>
+              <w:bottom w:val="single" w:color="A6A6A6" w:sz="4"/>
+              <w:right w:val="single" w:color="A6A6A6" w:sz="4"/>
+            </w:tcBorders>
+            <w:tcMar>
+              <w:top w:type="dxa" w:w="60"/>
+              <w:left w:type="dxa" w:w="90"/>
+              <w:bottom w:type="dxa" w:w="60"/>
+              <w:right w:type="dxa" w:w="90"/>
+            </w:tcMar>
+          </w:tcPr>
+          <w:p>
+            <w:pPr>
+              <w:spacing w:after="0"/>
+            </w:pPr>
+            <w:r>
+              <w:t xml:space="preserve">Calificación</w:t>
+            </w:r>
+          </w:p>
+        </w:tc>
+        <w:tc>
+          <w:tcPr>
+            <w:tcW w:type="dxa" w:w="1200"/>
+            <w:tcBorders>
+              <w:top w:val="single" w:color="A6A6A6" w:sz="4"/>
+              <w:left w:val="single" w:color="A6A6A6" w:sz="4"/>
+              <w:bottom w:val="single" w:color="A6A6A6" w:sz="4"/>
+              <w:right w:val="single" w:color="A6A6A6" w:sz="4"/>
+            </w:tcBorders>
+            <w:tcMar>
+              <w:top w:type="dxa" w:w="60"/>
+              <w:left w:type="dxa" w:w="90"/>
+              <w:bottom w:type="dxa" w:w="60"/>
+              <w:right w:type="dxa" w:w="90"/>
+            </w:tcMar>
+          </w:tcPr>
+          <w:p>
+            <w:pPr>
+              <w:spacing w:after="0"/>
+            </w:pPr>
+            <w:r>
+              <w:t xml:space="preserve">Bimestre</w:t>
+            </w:r>
+          </w:p>
+        </w:tc>
+        <w:tc>
+          <w:tcPr>
+            <w:tcW w:type="dxa" w:w="4238"/>
+            <w:tcBorders>
+              <w:top w:val="single" w:color="A6A6A6" w:sz="4"/>
+              <w:left w:val="single" w:color="A6A6A6" w:sz="4"/>
+              <w:bottom w:val="single" w:color="A6A6A6" w:sz="4"/>
+              <w:right w:val="single" w:color="A6A6A6" w:sz="4"/>
+            </w:tcBorders>
+            <w:tcMar>
+              <w:top w:type="dxa" w:w="60"/>
+              <w:left w:type="dxa" w:w="90"/>
+              <w:bottom w:type="dxa" w:w="60"/>
+              <w:right w:type="dxa" w:w="90"/>
+            </w:tcMar>
+          </w:tcPr>
+          <w:p>
+            <w:pPr>
+              <w:spacing w:after="0"/>
+            </w:pPr>
+            <w:r>
+              <w:t xml:space="preserve">una nota por competencia en el bimestre</w:t>
+            </w:r>
+          </w:p>
+        </w:tc>
+      </w:tr>
+      <w:tr>
+        <w:tc>
+          <w:tcPr>
+            <w:tcW w:type="dxa" w:w="2700"/>
+            <w:tcBorders>
+              <w:top w:val="single" w:color="A6A6A6" w:sz="4"/>
+              <w:left w:val="single" w:color="A6A6A6" w:sz="4"/>
+              <w:bottom w:val="single" w:color="A6A6A6" w:sz="4"/>
+              <w:right w:val="single" w:color="A6A6A6" w:sz="4"/>
+            </w:tcBorders>
+            <w:tcMar>
+              <w:top w:type="dxa" w:w="60"/>
+              <w:left w:type="dxa" w:w="90"/>
+              <w:bottom w:type="dxa" w:w="60"/>
+              <w:right w:type="dxa" w:w="90"/>
+            </w:tcMar>
+          </w:tcPr>
+          <w:p>
+            <w:pPr>
+              <w:spacing w:after="0"/>
+            </w:pPr>
+            <w:r>
+              <w:t xml:space="preserve">% de estudiantes aprobados</w:t>
+            </w:r>
+          </w:p>
+        </w:tc>
+        <w:tc>
+          <w:tcPr>
+            <w:tcW w:type="dxa" w:w="1500"/>
+            <w:tcBorders>
+              <w:top w:val="single" w:color="A6A6A6" w:sz="4"/>
+              <w:left w:val="single" w:color="A6A6A6" w:sz="4"/>
+              <w:bottom w:val="single" w:color="A6A6A6" w:sz="4"/>
+              <w:right w:val="single" w:color="A6A6A6" w:sz="4"/>
+            </w:tcBorders>
+            <w:tcMar>
+              <w:top w:type="dxa" w:w="60"/>
+              <w:left w:type="dxa" w:w="90"/>
+              <w:bottom w:type="dxa" w:w="60"/>
+              <w:right w:type="dxa" w:w="90"/>
+            </w:tcMar>
+          </w:tcPr>
+          <w:p>
+            <w:pPr>
+              <w:spacing w:after="0"/>
+            </w:pPr>
+            <w:r>
+              <w:t xml:space="preserve">Estudiante</w:t>
+            </w:r>
+          </w:p>
+        </w:tc>
+        <w:tc>
+          <w:tcPr>
+            <w:tcW w:type="dxa" w:w="1200"/>
+            <w:tcBorders>
+              <w:top w:val="single" w:color="A6A6A6" w:sz="4"/>
+              <w:left w:val="single" w:color="A6A6A6" w:sz="4"/>
+              <w:bottom w:val="single" w:color="A6A6A6" w:sz="4"/>
+              <w:right w:val="single" w:color="A6A6A6" w:sz="4"/>
+            </w:tcBorders>
+            <w:tcMar>
+              <w:top w:type="dxa" w:w="60"/>
+              <w:left w:type="dxa" w:w="90"/>
+              <w:bottom w:type="dxa" w:w="60"/>
+              <w:right w:type="dxa" w:w="90"/>
+            </w:tcMar>
+          </w:tcPr>
+          <w:p>
+            <w:pPr>
+              <w:spacing w:after="0"/>
+            </w:pPr>
+            <w:r>
+              <w:t xml:space="preserve">Bimestre</w:t>
+            </w:r>
+          </w:p>
+        </w:tc>
+        <w:tc>
+          <w:tcPr>
+            <w:tcW w:type="dxa" w:w="4238"/>
+            <w:tcBorders>
+              <w:top w:val="single" w:color="A6A6A6" w:sz="4"/>
+              <w:left w:val="single" w:color="A6A6A6" w:sz="4"/>
+              <w:bottom w:val="single" w:color="A6A6A6" w:sz="4"/>
+              <w:right w:val="single" w:color="A6A6A6" w:sz="4"/>
+            </w:tcBorders>
+            <w:tcMar>
+              <w:top w:type="dxa" w:w="60"/>
+              <w:left w:type="dxa" w:w="90"/>
+              <w:bottom w:type="dxa" w:w="60"/>
+              <w:right w:type="dxa" w:w="90"/>
+            </w:tcMar>
+          </w:tcPr>
+          <w:p>
+            <w:pPr>
+              <w:spacing w:after="0"/>
+            </w:pPr>
+            <w:r>
+              <w:t xml:space="preserve">se cuentan personas, no notas</w:t>
+            </w:r>
+          </w:p>
+        </w:tc>
+      </w:tr>
+    </w:tbl>
+    <w:p>
+      <w:pPr>
+        <w:pBdr>
+          <w:left w:val="single" w:color="040063" w:sz="18" w:space="8"/>
+        </w:pBdr>
+        <w:spacing w:after="160" w:before="80"/>
+        <w:ind w:left="200"/>
+      </w:pPr>
+      <w:r>
+        <w:rPr>
+          <w:i/>
+          <w:iCs/>
+          <w:color w:val="1F3864"/>
+        </w:rPr>
+        <w:t xml:space="preserve">Frase: «El hecho tiene su grano, pero cada medida dice a qué nivel se lee: una vacante se mide por sección y año; un aprobado, por estudiante y bimestre».</w:t>
+      </w:r>
+    </w:p>
+    <w:p>
+      <w:pPr>
         <w:pStyle w:val="Heading2"/>
       </w:pPr>
       <w:r>
@@ -4015,6 +5745,44 @@
       </w:r>
       <w:r>
         <w:t xml:space="preserve"> indicador o KPI que se arma con DAX a partir de las métricas.</w:t>
+      </w:r>
+    </w:p>
+    <w:p>
+      <w:pPr>
+        <w:spacing w:after="120"/>
+      </w:pPr>
+      <w:r>
+        <w:t xml:space="preserve">Hay </w:t>
+      </w:r>
+      <w:r>
+        <w:rPr>
+          <w:b/>
+          <w:bCs/>
+        </w:rPr>
+        <w:t xml:space="preserve">dos versiones</w:t>
+      </w:r>
+      <w:r>
+        <w:t xml:space="preserve"> del archivo: la </w:t>
+      </w:r>
+      <w:r>
+        <w:rPr>
+          <w:b/>
+          <w:bCs/>
+        </w:rPr>
+        <w:t xml:space="preserve">pública</w:t>
+      </w:r>
+      <w:r>
+        <w:t xml:space="preserve"> (la del Drive, para exponer) solo trae lo esencial —medida, tipo, grano, fórmula simple, estado y observación corta—; la </w:t>
+      </w:r>
+      <w:r>
+        <w:rPr>
+          <w:b/>
+          <w:bCs/>
+        </w:rPr>
+        <w:t xml:space="preserve">interna</w:t>
+      </w:r>
+      <w:r>
+        <w:t xml:space="preserve"> (en el repositorio) conserva leyendas, anotaciones y el detalle técnico para el equipo.</w:t>
       </w:r>
     </w:p>
     <w:p>
@@ -8947,7 +10715,7 @@
               <w:spacing w:after="0"/>
             </w:pPr>
             <w:r>
-              <w:t xml:space="preserve">Qué representa una fila del hecho y a qué nivel de detalle (Matrícula–Año).</w:t>
+              <w:t xml:space="preserve">Qué representa una fila y a qué nivel de jerarquía, en una palabra + nivel (Matrícula – Año). Se indica por medida.</w:t>
             </w:r>
           </w:p>
         </w:tc>

</xml_diff>